<commit_message>
📝 UPDATE: Replace the existing Board Resolution Clickpesa format document with an updated version. This change ensures that users have access to the latest format for board resolutions, improving compliance and standardization in documentation practices.
</commit_message>
<xml_diff>
--- a/images/knowledge-base/files/Board-Resolution-Clickpesa-Format.docx
+++ b/images/knowledge-base/files/Board-Resolution-Clickpesa-Format.docx
@@ -49,17 +49,7 @@
           <w:sz w:val="24"/>
           <w:szCs w:val="24"/>
         </w:rPr>
-        <w:t>(Insert Name of the Company</w:t>
-      </w:r>
-      <w:r>
-        <w:rPr>
-          <w:rFonts w:ascii="Times New Roman" w:hAnsi="Times New Roman" w:cs="Times New Roman"/>
-          <w:b/>
-          <w:i/>
-          <w:sz w:val="24"/>
-          <w:szCs w:val="24"/>
-        </w:rPr>
-        <w:t>)</w:t>
+        <w:t>(Insert Name of the Company)</w:t>
       </w:r>
       <w:r>
         <w:rPr>
@@ -131,17 +121,7 @@
           <w:sz w:val="24"/>
           <w:szCs w:val="24"/>
         </w:rPr>
-        <w:t>(Insert Name of the Company</w:t>
-      </w:r>
-      <w:r>
-        <w:rPr>
-          <w:rFonts w:ascii="Times New Roman" w:hAnsi="Times New Roman" w:cs="Times New Roman"/>
-          <w:b/>
-          <w:i/>
-          <w:sz w:val="24"/>
-          <w:szCs w:val="24"/>
-        </w:rPr>
-        <w:t>)</w:t>
+        <w:t>(Insert Name of the Company)</w:t>
       </w:r>
       <w:r>
         <w:rPr>
@@ -229,15 +209,7 @@
           <w:sz w:val="24"/>
           <w:szCs w:val="24"/>
         </w:rPr>
-        <w:t>I</w:t>
-      </w:r>
-      <w:r>
-        <w:rPr>
-          <w:rFonts w:ascii="Times New Roman" w:hAnsi="Times New Roman" w:cs="Times New Roman"/>
-          <w:sz w:val="24"/>
-          <w:szCs w:val="24"/>
-        </w:rPr>
-        <w:t xml:space="preserve">s hereby appointed to open </w:t>
+        <w:t xml:space="preserve">Is hereby appointed to open </w:t>
       </w:r>
       <w:proofErr w:type="spellStart"/>
       <w:r>
@@ -520,8 +492,207 @@
         </w:rPr>
         <w:t>and remain in force until written notice to the contrary.</w:t>
       </w:r>
+    </w:p>
+    <w:p>
+      <w:pPr>
+        <w:ind w:left="360"/>
+        <w:rPr>
+          <w:rFonts w:ascii="Times New Roman" w:hAnsi="Times New Roman" w:cs="Times New Roman"/>
+          <w:sz w:val="24"/>
+          <w:szCs w:val="24"/>
+        </w:rPr>
+      </w:pPr>
+      <w:r>
+        <w:rPr>
+          <w:rFonts w:ascii="Times New Roman" w:hAnsi="Times New Roman" w:cs="Times New Roman"/>
+          <w:sz w:val="24"/>
+          <w:szCs w:val="24"/>
+        </w:rPr>
+        <w:t>It is hereby certified by the undersigned t</w:t>
+      </w:r>
+      <w:r>
+        <w:rPr>
+          <w:rFonts w:ascii="Times New Roman" w:hAnsi="Times New Roman" w:cs="Times New Roman"/>
+          <w:sz w:val="24"/>
+          <w:szCs w:val="24"/>
+        </w:rPr>
+        <w:t>hat the foregoing resolution is</w:t>
+      </w:r>
+      <w:r>
+        <w:rPr>
+          <w:rFonts w:ascii="Times New Roman" w:hAnsi="Times New Roman" w:cs="Times New Roman"/>
+          <w:sz w:val="24"/>
+          <w:szCs w:val="24"/>
+        </w:rPr>
+        <w:t xml:space="preserve"> duly passed by the</w:t>
+      </w:r>
+      <w:r>
+        <w:rPr>
+          <w:rFonts w:ascii="Times New Roman" w:hAnsi="Times New Roman" w:cs="Times New Roman"/>
+          <w:sz w:val="24"/>
+          <w:szCs w:val="24"/>
+        </w:rPr>
+        <w:t xml:space="preserve"> Board of Directors of the above </w:t>
+      </w:r>
+      <w:r>
+        <w:rPr>
+          <w:rFonts w:ascii="Times New Roman" w:hAnsi="Times New Roman" w:cs="Times New Roman"/>
+          <w:sz w:val="24"/>
+          <w:szCs w:val="24"/>
+        </w:rPr>
+        <w:t>named Company</w:t>
+      </w:r>
+      <w:r>
+        <w:rPr>
+          <w:rFonts w:ascii="Times New Roman" w:hAnsi="Times New Roman" w:cs="Times New Roman"/>
+          <w:sz w:val="24"/>
+          <w:szCs w:val="24"/>
+        </w:rPr>
+        <w:t xml:space="preserve"> on </w:t>
+      </w:r>
+      <w:r>
+        <w:rPr>
+          <w:rFonts w:ascii="Times New Roman" w:hAnsi="Times New Roman" w:cs="Times New Roman"/>
+          <w:sz w:val="24"/>
+          <w:szCs w:val="24"/>
+        </w:rPr>
+        <w:t>………..</w:t>
+      </w:r>
+      <w:r>
+        <w:rPr>
+          <w:rFonts w:ascii="Times New Roman" w:hAnsi="Times New Roman" w:cs="Times New Roman"/>
+          <w:sz w:val="24"/>
+          <w:szCs w:val="24"/>
+        </w:rPr>
+        <w:t xml:space="preserve"> day o</w:t>
+      </w:r>
+      <w:r>
+        <w:rPr>
+          <w:rFonts w:ascii="Times New Roman" w:hAnsi="Times New Roman" w:cs="Times New Roman"/>
+          <w:sz w:val="24"/>
+          <w:szCs w:val="24"/>
+        </w:rPr>
+        <w:t>f………</w:t>
+      </w:r>
+      <w:r>
+        <w:rPr>
+          <w:rFonts w:ascii="Times New Roman" w:hAnsi="Times New Roman" w:cs="Times New Roman"/>
+          <w:sz w:val="24"/>
+          <w:szCs w:val="24"/>
+        </w:rPr>
+        <w:t>……..</w:t>
+      </w:r>
+      <w:r>
+        <w:rPr>
+          <w:rFonts w:ascii="Times New Roman" w:hAnsi="Times New Roman" w:cs="Times New Roman"/>
+          <w:sz w:val="24"/>
+          <w:szCs w:val="24"/>
+        </w:rPr>
+        <w:t>.year……</w:t>
+      </w:r>
+    </w:p>
+    <w:p>
+      <w:pPr>
+        <w:ind w:left="360"/>
+        <w:rPr>
+          <w:rFonts w:ascii="Times New Roman" w:hAnsi="Times New Roman" w:cs="Times New Roman"/>
+          <w:b/>
+          <w:i/>
+          <w:color w:val="FF0000"/>
+          <w:sz w:val="24"/>
+          <w:szCs w:val="24"/>
+        </w:rPr>
+      </w:pPr>
       <w:bookmarkStart w:id="0" w:name="_GoBack"/>
       <w:bookmarkEnd w:id="0"/>
+      <w:r>
+        <w:rPr>
+          <w:rFonts w:ascii="Times New Roman" w:hAnsi="Times New Roman" w:cs="Times New Roman"/>
+          <w:b/>
+          <w:i/>
+          <w:color w:val="FF0000"/>
+          <w:sz w:val="24"/>
+          <w:szCs w:val="24"/>
+        </w:rPr>
+        <w:t xml:space="preserve">(Resolution to be </w:t>
+      </w:r>
+      <w:r>
+        <w:rPr>
+          <w:rFonts w:ascii="Times New Roman" w:hAnsi="Times New Roman" w:cs="Times New Roman"/>
+          <w:b/>
+          <w:i/>
+          <w:color w:val="FF0000"/>
+          <w:sz w:val="24"/>
+          <w:szCs w:val="24"/>
+        </w:rPr>
+        <w:t xml:space="preserve">signed by </w:t>
+      </w:r>
+      <w:r>
+        <w:rPr>
+          <w:rFonts w:ascii="Times New Roman" w:hAnsi="Times New Roman" w:cs="Times New Roman"/>
+          <w:b/>
+          <w:i/>
+          <w:color w:val="FF0000"/>
+          <w:sz w:val="24"/>
+          <w:szCs w:val="24"/>
+        </w:rPr>
+        <w:t xml:space="preserve">Directors and Company Secretary only, this means </w:t>
+      </w:r>
+      <w:r>
+        <w:rPr>
+          <w:rFonts w:ascii="Times New Roman" w:hAnsi="Times New Roman" w:cs="Times New Roman"/>
+          <w:b/>
+          <w:i/>
+          <w:color w:val="FF0000"/>
+          <w:sz w:val="24"/>
+          <w:szCs w:val="24"/>
+        </w:rPr>
+        <w:t xml:space="preserve"> two (2) Directors  or one</w:t>
+      </w:r>
+      <w:r>
+        <w:rPr>
+          <w:rFonts w:ascii="Times New Roman" w:hAnsi="Times New Roman" w:cs="Times New Roman"/>
+          <w:b/>
+          <w:i/>
+          <w:color w:val="FF0000"/>
+          <w:sz w:val="24"/>
+          <w:szCs w:val="24"/>
+        </w:rPr>
+        <w:t xml:space="preserve"> </w:t>
+      </w:r>
+      <w:r>
+        <w:rPr>
+          <w:rFonts w:ascii="Times New Roman" w:hAnsi="Times New Roman" w:cs="Times New Roman"/>
+          <w:b/>
+          <w:i/>
+          <w:color w:val="FF0000"/>
+          <w:sz w:val="24"/>
+          <w:szCs w:val="24"/>
+        </w:rPr>
+        <w:t>(1) Director and Company Secretary</w:t>
+      </w:r>
+      <w:r>
+        <w:rPr>
+          <w:rFonts w:ascii="Times New Roman" w:hAnsi="Times New Roman" w:cs="Times New Roman"/>
+          <w:b/>
+          <w:i/>
+          <w:color w:val="FF0000"/>
+          <w:sz w:val="24"/>
+          <w:szCs w:val="24"/>
+        </w:rPr>
+        <w:t xml:space="preserve"> and not otherwise</w:t>
+      </w:r>
+      <w:r>
+        <w:rPr>
+          <w:rFonts w:ascii="Times New Roman" w:hAnsi="Times New Roman" w:cs="Times New Roman"/>
+          <w:b/>
+          <w:i/>
+          <w:color w:val="FF0000"/>
+          <w:sz w:val="24"/>
+          <w:szCs w:val="24"/>
+        </w:rPr>
+        <w:t>)</w:t>
+      </w:r>
     </w:p>
     <w:p>
       <w:pPr>
@@ -532,69 +703,23 @@
           <w:szCs w:val="24"/>
         </w:rPr>
       </w:pPr>
-      <w:r>
-        <w:rPr>
-          <w:rFonts w:ascii="Times New Roman" w:hAnsi="Times New Roman" w:cs="Times New Roman"/>
-          <w:sz w:val="24"/>
-          <w:szCs w:val="24"/>
-        </w:rPr>
-        <w:t>It is hereby certified by the undersigned t</w:t>
-      </w:r>
-      <w:r>
-        <w:rPr>
-          <w:rFonts w:ascii="Times New Roman" w:hAnsi="Times New Roman" w:cs="Times New Roman"/>
-          <w:sz w:val="24"/>
-          <w:szCs w:val="24"/>
-        </w:rPr>
-        <w:t>hat the foregoing resolution is</w:t>
-      </w:r>
-      <w:r>
-        <w:rPr>
-          <w:rFonts w:ascii="Times New Roman" w:hAnsi="Times New Roman" w:cs="Times New Roman"/>
-          <w:sz w:val="24"/>
-          <w:szCs w:val="24"/>
-        </w:rPr>
-        <w:t xml:space="preserve"> duly passed by the</w:t>
-      </w:r>
-      <w:r>
-        <w:rPr>
-          <w:rFonts w:ascii="Times New Roman" w:hAnsi="Times New Roman" w:cs="Times New Roman"/>
-          <w:sz w:val="24"/>
-          <w:szCs w:val="24"/>
-        </w:rPr>
-        <w:t xml:space="preserve"> Board of Directors of the above </w:t>
-      </w:r>
-      <w:r>
-        <w:rPr>
-          <w:rFonts w:ascii="Times New Roman" w:hAnsi="Times New Roman" w:cs="Times New Roman"/>
-          <w:sz w:val="24"/>
-          <w:szCs w:val="24"/>
-        </w:rPr>
-        <w:t>named Company</w:t>
-      </w:r>
-      <w:r>
-        <w:rPr>
-          <w:rFonts w:ascii="Times New Roman" w:hAnsi="Times New Roman" w:cs="Times New Roman"/>
-          <w:sz w:val="24"/>
-          <w:szCs w:val="24"/>
-        </w:rPr>
-        <w:t xml:space="preserve"> on </w:t>
-      </w:r>
-      <w:r>
-        <w:rPr>
-          <w:rFonts w:ascii="Times New Roman" w:hAnsi="Times New Roman" w:cs="Times New Roman"/>
-          <w:sz w:val="24"/>
-          <w:szCs w:val="24"/>
-        </w:rPr>
-        <w:t>………..</w:t>
-      </w:r>
-      <w:r>
-        <w:rPr>
-          <w:rFonts w:ascii="Times New Roman" w:hAnsi="Times New Roman" w:cs="Times New Roman"/>
-          <w:sz w:val="24"/>
-          <w:szCs w:val="24"/>
-        </w:rPr>
-        <w:t xml:space="preserve"> </w:t>
+    </w:p>
+    <w:p>
+      <w:pPr>
+        <w:ind w:left="360"/>
+        <w:rPr>
+          <w:rFonts w:ascii="Times New Roman" w:hAnsi="Times New Roman" w:cs="Times New Roman"/>
+          <w:sz w:val="24"/>
+          <w:szCs w:val="24"/>
+        </w:rPr>
+      </w:pPr>
+      <w:r>
+        <w:rPr>
+          <w:rFonts w:ascii="Times New Roman" w:hAnsi="Times New Roman" w:cs="Times New Roman"/>
+          <w:sz w:val="24"/>
+          <w:szCs w:val="24"/>
+        </w:rPr>
+        <w:t>Name</w:t>
       </w:r>
       <w:proofErr w:type="gramStart"/>
       <w:r>
@@ -603,85 +728,37 @@
           <w:sz w:val="24"/>
           <w:szCs w:val="24"/>
         </w:rPr>
-        <w:t>day</w:t>
+        <w:t>:…………………………</w:t>
       </w:r>
       <w:proofErr w:type="gramEnd"/>
-      <w:r>
-        <w:rPr>
-          <w:rFonts w:ascii="Times New Roman" w:hAnsi="Times New Roman" w:cs="Times New Roman"/>
-          <w:sz w:val="24"/>
-          <w:szCs w:val="24"/>
-        </w:rPr>
-        <w:t xml:space="preserve"> o</w:t>
-      </w:r>
-      <w:r>
-        <w:rPr>
-          <w:rFonts w:ascii="Times New Roman" w:hAnsi="Times New Roman" w:cs="Times New Roman"/>
-          <w:sz w:val="24"/>
-          <w:szCs w:val="24"/>
-        </w:rPr>
-        <w:t>f………</w:t>
-      </w:r>
-      <w:r>
-        <w:rPr>
-          <w:rFonts w:ascii="Times New Roman" w:hAnsi="Times New Roman" w:cs="Times New Roman"/>
-          <w:sz w:val="24"/>
-          <w:szCs w:val="24"/>
-        </w:rPr>
-        <w:t>……..</w:t>
-      </w:r>
-      <w:r>
-        <w:rPr>
-          <w:rFonts w:ascii="Times New Roman" w:hAnsi="Times New Roman" w:cs="Times New Roman"/>
-          <w:sz w:val="24"/>
-          <w:szCs w:val="24"/>
-        </w:rPr>
-        <w:t>.2024</w:t>
-      </w:r>
     </w:p>
     <w:p>
       <w:pPr>
         <w:ind w:left="360"/>
         <w:rPr>
           <w:rFonts w:ascii="Times New Roman" w:hAnsi="Times New Roman" w:cs="Times New Roman"/>
-          <w:b/>
-          <w:i/>
-          <w:sz w:val="24"/>
-          <w:szCs w:val="24"/>
-        </w:rPr>
-      </w:pPr>
-      <w:r>
-        <w:rPr>
-          <w:rFonts w:ascii="Times New Roman" w:hAnsi="Times New Roman" w:cs="Times New Roman"/>
-          <w:b/>
-          <w:i/>
-          <w:sz w:val="24"/>
-          <w:szCs w:val="24"/>
-        </w:rPr>
-        <w:t xml:space="preserve">(This Resolution should be signed by at least two (2) </w:t>
+          <w:sz w:val="24"/>
+          <w:szCs w:val="24"/>
+        </w:rPr>
+      </w:pPr>
+      <w:r>
+        <w:rPr>
+          <w:rFonts w:ascii="Times New Roman" w:hAnsi="Times New Roman" w:cs="Times New Roman"/>
+          <w:sz w:val="24"/>
+          <w:szCs w:val="24"/>
+        </w:rPr>
+        <w:t>Signature</w:t>
       </w:r>
       <w:proofErr w:type="gramStart"/>
       <w:r>
         <w:rPr>
           <w:rFonts w:ascii="Times New Roman" w:hAnsi="Times New Roman" w:cs="Times New Roman"/>
-          <w:b/>
-          <w:i/>
-          <w:sz w:val="24"/>
-          <w:szCs w:val="24"/>
-        </w:rPr>
-        <w:t>Directors  or</w:t>
+          <w:sz w:val="24"/>
+          <w:szCs w:val="24"/>
+        </w:rPr>
+        <w:t>:……………………..</w:t>
       </w:r>
       <w:proofErr w:type="gramEnd"/>
-      <w:r>
-        <w:rPr>
-          <w:rFonts w:ascii="Times New Roman" w:hAnsi="Times New Roman" w:cs="Times New Roman"/>
-          <w:b/>
-          <w:i/>
-          <w:sz w:val="24"/>
-          <w:szCs w:val="24"/>
-        </w:rPr>
-        <w:t xml:space="preserve"> one(1) Director and Company Secretary)</w:t>
-      </w:r>
     </w:p>
     <w:p>
       <w:pPr>
@@ -698,6 +775,135 @@
           <w:sz w:val="24"/>
           <w:szCs w:val="24"/>
         </w:rPr>
+        <w:t xml:space="preserve">Position: </w:t>
+      </w:r>
+      <w:r>
+        <w:rPr>
+          <w:rFonts w:ascii="Times New Roman" w:hAnsi="Times New Roman" w:cs="Times New Roman"/>
+          <w:b/>
+          <w:sz w:val="24"/>
+          <w:szCs w:val="24"/>
+        </w:rPr>
+        <w:t>Director/ Managing Director/ Company Secretary</w:t>
+      </w:r>
+    </w:p>
+    <w:p>
+      <w:pPr>
+        <w:ind w:left="360"/>
+        <w:rPr>
+          <w:rFonts w:ascii="Times New Roman" w:hAnsi="Times New Roman" w:cs="Times New Roman"/>
+          <w:sz w:val="24"/>
+          <w:szCs w:val="24"/>
+        </w:rPr>
+      </w:pPr>
+      <w:r>
+        <w:rPr>
+          <w:rFonts w:ascii="Times New Roman" w:hAnsi="Times New Roman" w:cs="Times New Roman"/>
+          <w:sz w:val="24"/>
+          <w:szCs w:val="24"/>
+        </w:rPr>
+        <w:tab/>
+      </w:r>
+      <w:r>
+        <w:rPr>
+          <w:rFonts w:ascii="Times New Roman" w:hAnsi="Times New Roman" w:cs="Times New Roman"/>
+          <w:sz w:val="24"/>
+          <w:szCs w:val="24"/>
+        </w:rPr>
+        <w:tab/>
+      </w:r>
+      <w:r>
+        <w:rPr>
+          <w:rFonts w:ascii="Times New Roman" w:hAnsi="Times New Roman" w:cs="Times New Roman"/>
+          <w:sz w:val="24"/>
+          <w:szCs w:val="24"/>
+        </w:rPr>
+        <w:tab/>
+      </w:r>
+      <w:r>
+        <w:rPr>
+          <w:rFonts w:ascii="Times New Roman" w:hAnsi="Times New Roman" w:cs="Times New Roman"/>
+          <w:sz w:val="24"/>
+          <w:szCs w:val="24"/>
+        </w:rPr>
+        <w:tab/>
+      </w:r>
+      <w:r>
+        <w:rPr>
+          <w:rFonts w:ascii="Times New Roman" w:hAnsi="Times New Roman" w:cs="Times New Roman"/>
+          <w:sz w:val="24"/>
+          <w:szCs w:val="24"/>
+        </w:rPr>
+        <w:tab/>
+      </w:r>
+      <w:r>
+        <w:rPr>
+          <w:rFonts w:ascii="Times New Roman" w:hAnsi="Times New Roman" w:cs="Times New Roman"/>
+          <w:sz w:val="24"/>
+          <w:szCs w:val="24"/>
+        </w:rPr>
+        <w:tab/>
+      </w:r>
+      <w:r>
+        <w:rPr>
+          <w:rFonts w:ascii="Times New Roman" w:hAnsi="Times New Roman" w:cs="Times New Roman"/>
+          <w:sz w:val="24"/>
+          <w:szCs w:val="24"/>
+        </w:rPr>
+        <w:tab/>
+      </w:r>
+      <w:r>
+        <w:rPr>
+          <w:rFonts w:ascii="Times New Roman" w:hAnsi="Times New Roman" w:cs="Times New Roman"/>
+          <w:sz w:val="24"/>
+          <w:szCs w:val="24"/>
+        </w:rPr>
+        <w:tab/>
+      </w:r>
+    </w:p>
+    <w:p>
+      <w:pPr>
+        <w:ind w:left="360"/>
+        <w:rPr>
+          <w:rFonts w:ascii="Times New Roman" w:hAnsi="Times New Roman" w:cs="Times New Roman"/>
+          <w:b/>
+          <w:sz w:val="24"/>
+          <w:szCs w:val="24"/>
+        </w:rPr>
+      </w:pPr>
+      <w:r>
+        <w:rPr>
+          <w:rFonts w:ascii="Times New Roman" w:hAnsi="Times New Roman" w:cs="Times New Roman"/>
+          <w:sz w:val="24"/>
+          <w:szCs w:val="24"/>
+        </w:rPr>
+        <w:t xml:space="preserve">                                                                                                            </w:t>
+      </w:r>
+      <w:r>
+        <w:rPr>
+          <w:rFonts w:ascii="Times New Roman" w:hAnsi="Times New Roman" w:cs="Times New Roman"/>
+          <w:b/>
+          <w:sz w:val="24"/>
+          <w:szCs w:val="24"/>
+        </w:rPr>
+        <w:t>COMPANY SEAL</w:t>
+      </w:r>
+    </w:p>
+    <w:p>
+      <w:pPr>
+        <w:ind w:left="360"/>
+        <w:rPr>
+          <w:rFonts w:ascii="Times New Roman" w:hAnsi="Times New Roman" w:cs="Times New Roman"/>
+          <w:sz w:val="24"/>
+          <w:szCs w:val="24"/>
+        </w:rPr>
+      </w:pPr>
+      <w:r>
+        <w:rPr>
+          <w:rFonts w:ascii="Times New Roman" w:hAnsi="Times New Roman" w:cs="Times New Roman"/>
+          <w:sz w:val="24"/>
+          <w:szCs w:val="24"/>
+        </w:rPr>
         <w:t>Name</w:t>
       </w:r>
       <w:proofErr w:type="gramStart"/>
@@ -754,177 +960,17 @@
           <w:sz w:val="24"/>
           <w:szCs w:val="24"/>
         </w:rPr>
-        <w:t>Position</w:t>
-      </w:r>
-      <w:proofErr w:type="gramStart"/>
-      <w:r>
-        <w:rPr>
-          <w:rFonts w:ascii="Times New Roman" w:hAnsi="Times New Roman" w:cs="Times New Roman"/>
-          <w:sz w:val="24"/>
-          <w:szCs w:val="24"/>
-        </w:rPr>
-        <w:t>:……………………….</w:t>
-      </w:r>
-      <w:proofErr w:type="gramEnd"/>
-    </w:p>
-    <w:p>
-      <w:pPr>
-        <w:ind w:left="360"/>
-        <w:rPr>
-          <w:rFonts w:ascii="Times New Roman" w:hAnsi="Times New Roman" w:cs="Times New Roman"/>
-          <w:sz w:val="24"/>
-          <w:szCs w:val="24"/>
-        </w:rPr>
-      </w:pPr>
-      <w:r>
-        <w:rPr>
-          <w:rFonts w:ascii="Times New Roman" w:hAnsi="Times New Roman" w:cs="Times New Roman"/>
-          <w:sz w:val="24"/>
-          <w:szCs w:val="24"/>
-        </w:rPr>
-        <w:tab/>
-      </w:r>
-      <w:r>
-        <w:rPr>
-          <w:rFonts w:ascii="Times New Roman" w:hAnsi="Times New Roman" w:cs="Times New Roman"/>
-          <w:sz w:val="24"/>
-          <w:szCs w:val="24"/>
-        </w:rPr>
-        <w:tab/>
-      </w:r>
-      <w:r>
-        <w:rPr>
-          <w:rFonts w:ascii="Times New Roman" w:hAnsi="Times New Roman" w:cs="Times New Roman"/>
-          <w:sz w:val="24"/>
-          <w:szCs w:val="24"/>
-        </w:rPr>
-        <w:tab/>
-      </w:r>
-      <w:r>
-        <w:rPr>
-          <w:rFonts w:ascii="Times New Roman" w:hAnsi="Times New Roman" w:cs="Times New Roman"/>
-          <w:sz w:val="24"/>
-          <w:szCs w:val="24"/>
-        </w:rPr>
-        <w:tab/>
-      </w:r>
-      <w:r>
-        <w:rPr>
-          <w:rFonts w:ascii="Times New Roman" w:hAnsi="Times New Roman" w:cs="Times New Roman"/>
-          <w:sz w:val="24"/>
-          <w:szCs w:val="24"/>
-        </w:rPr>
-        <w:tab/>
-      </w:r>
-      <w:r>
-        <w:rPr>
-          <w:rFonts w:ascii="Times New Roman" w:hAnsi="Times New Roman" w:cs="Times New Roman"/>
-          <w:sz w:val="24"/>
-          <w:szCs w:val="24"/>
-        </w:rPr>
-        <w:tab/>
-      </w:r>
-      <w:r>
-        <w:rPr>
-          <w:rFonts w:ascii="Times New Roman" w:hAnsi="Times New Roman" w:cs="Times New Roman"/>
-          <w:sz w:val="24"/>
-          <w:szCs w:val="24"/>
-        </w:rPr>
-        <w:tab/>
-      </w:r>
-      <w:r>
-        <w:rPr>
-          <w:rFonts w:ascii="Times New Roman" w:hAnsi="Times New Roman" w:cs="Times New Roman"/>
-          <w:sz w:val="24"/>
-          <w:szCs w:val="24"/>
-        </w:rPr>
-        <w:tab/>
-        <w:t>COMPANY SEAL</w:t>
-      </w:r>
-    </w:p>
-    <w:p>
-      <w:pPr>
-        <w:ind w:left="360"/>
-        <w:rPr>
-          <w:rFonts w:ascii="Times New Roman" w:hAnsi="Times New Roman" w:cs="Times New Roman"/>
-          <w:sz w:val="24"/>
-          <w:szCs w:val="24"/>
-        </w:rPr>
-      </w:pPr>
-      <w:r>
-        <w:rPr>
-          <w:rFonts w:ascii="Times New Roman" w:hAnsi="Times New Roman" w:cs="Times New Roman"/>
-          <w:sz w:val="24"/>
-          <w:szCs w:val="24"/>
-        </w:rPr>
-        <w:t>Name</w:t>
-      </w:r>
-      <w:proofErr w:type="gramStart"/>
-      <w:r>
-        <w:rPr>
-          <w:rFonts w:ascii="Times New Roman" w:hAnsi="Times New Roman" w:cs="Times New Roman"/>
-          <w:sz w:val="24"/>
-          <w:szCs w:val="24"/>
-        </w:rPr>
-        <w:t>:…………………………</w:t>
-      </w:r>
-      <w:proofErr w:type="gramEnd"/>
-    </w:p>
-    <w:p>
-      <w:pPr>
-        <w:ind w:left="360"/>
-        <w:rPr>
-          <w:rFonts w:ascii="Times New Roman" w:hAnsi="Times New Roman" w:cs="Times New Roman"/>
-          <w:sz w:val="24"/>
-          <w:szCs w:val="24"/>
-        </w:rPr>
-      </w:pPr>
-      <w:r>
-        <w:rPr>
-          <w:rFonts w:ascii="Times New Roman" w:hAnsi="Times New Roman" w:cs="Times New Roman"/>
-          <w:sz w:val="24"/>
-          <w:szCs w:val="24"/>
-        </w:rPr>
-        <w:t>Signature</w:t>
-      </w:r>
-      <w:proofErr w:type="gramStart"/>
-      <w:r>
-        <w:rPr>
-          <w:rFonts w:ascii="Times New Roman" w:hAnsi="Times New Roman" w:cs="Times New Roman"/>
-          <w:sz w:val="24"/>
-          <w:szCs w:val="24"/>
-        </w:rPr>
-        <w:t>:……………………..</w:t>
-      </w:r>
-      <w:proofErr w:type="gramEnd"/>
-    </w:p>
-    <w:p>
-      <w:pPr>
-        <w:ind w:left="360"/>
-        <w:rPr>
-          <w:rFonts w:ascii="Times New Roman" w:hAnsi="Times New Roman" w:cs="Times New Roman"/>
-          <w:sz w:val="24"/>
-          <w:szCs w:val="24"/>
-        </w:rPr>
-      </w:pPr>
-      <w:r>
-        <w:rPr>
-          <w:rFonts w:ascii="Times New Roman" w:hAnsi="Times New Roman" w:cs="Times New Roman"/>
-          <w:sz w:val="24"/>
-          <w:szCs w:val="24"/>
-        </w:rPr>
-        <w:t>Position</w:t>
-      </w:r>
-      <w:proofErr w:type="gramStart"/>
-      <w:r>
-        <w:rPr>
-          <w:rFonts w:ascii="Times New Roman" w:hAnsi="Times New Roman" w:cs="Times New Roman"/>
-          <w:sz w:val="24"/>
-          <w:szCs w:val="24"/>
-        </w:rPr>
-        <w:t>:……………………….</w:t>
-      </w:r>
-      <w:proofErr w:type="gramEnd"/>
+        <w:t xml:space="preserve">Position: </w:t>
+      </w:r>
+      <w:r>
+        <w:rPr>
+          <w:rFonts w:ascii="Times New Roman" w:hAnsi="Times New Roman" w:cs="Times New Roman"/>
+          <w:b/>
+          <w:sz w:val="24"/>
+          <w:szCs w:val="24"/>
+        </w:rPr>
+        <w:t>Director/ Managing Director/ Company Secretary</w:t>
+      </w:r>
     </w:p>
     <w:sectPr>
       <w:pgSz w:w="12240" w:h="15840"/>

</xml_diff>